<commit_message>
Roteiro Roberto Müller: gancho mais aberto
Co-Authored-By: Claude Opus 5.5 <noreply@anthropic.com>
Claude-Session: https://claude.ai/code/session_01MJjUEEZrxQDEUifKK2vj9g
</commit_message>
<xml_diff>
--- a/roteiros/roberto-muller/RobertoMuller_Parte1_Introducao.docx
+++ b/roteiros/roberto-muller/RobertoMuller_Parte1_Introducao.docx
@@ -15,7 +15,7 @@
         <w:rPr>
           <w:color w:val="C00000"/>
         </w:rPr>
-        <w:t>Roberto Müller leu a notícia da própria morte no dia em que era homenageado por cinquenta anos de carreira. A frase estava impressa num livro do governo do próprio estado dele.</w:t>
+        <w:t>Roberto Müller foi dado como morto enquanto ainda estava vivo. E descobriu isso da forma mais cruel possível.</w:t>
       </w:r>
     </w:p>
     <w:p>
@@ -23,7 +23,7 @@
         <w:rPr>
           <w:color w:val="C00000"/>
         </w:rPr>
-        <w:t>Mas o fim mais cruel da vida dele aconteceu anos depois, longe dos palcos, dentro de um quarto no Recife. E o Brasil não viu.</w:t>
+        <w:t>Mas o pior ainda estava por vir. O verdadeiro fim dele aconteceu longe dos palcos, e o Brasil não viu.</w:t>
       </w:r>
     </w:p>
     <w:p>

</xml_diff>

<commit_message>
Roteiro Roberto Müller: parte 5 final, novos fatos verificados e roteiro completo
Co-Authored-By: Claude Opus 5.5 <noreply@anthropic.com>
Claude-Session: https://claude.ai/code/session_01MJjUEEZrxQDEUifKK2vj9g
</commit_message>
<xml_diff>
--- a/roteiros/roberto-muller/RobertoMuller_Parte1_Introducao.docx
+++ b/roteiros/roberto-muller/RobertoMuller_Parte1_Introducao.docx
@@ -127,7 +127,7 @@
         <w:rPr>
           <w:color w:val="000000"/>
         </w:rPr>
-        <w:t>Recebeu o incentivo de gente do próprio rádio maranhense, gente que ouviu aquele rapaz franzino cantar e percebeu que ali havia alguma coisa rara.</w:t>
+        <w:t>Recebeu o incentivo de gente do próprio rádio maranhense, como a radialista Orlandira Matos. Gente que ouviu aquele rapaz franzino cantar e percebeu que ali havia alguma coisa rara.</w:t>
       </w:r>
     </w:p>
     <w:p>
@@ -351,7 +351,7 @@
         <w:rPr>
           <w:color w:val="C00000"/>
         </w:rPr>
-        <w:t>Lembre bem desses seis discos de ouro. Porque, sessenta anos depois, o dono deles estaria numa casa no Recife onde faltava dinheiro. E quase ninguém fora daquela casa sabia.</w:t>
+        <w:t>Lembre bem desses seis discos de ouro. Porque, sessenta anos depois, o dono deles estaria vivendo num apartamento modesto no Recife, com uma aposentadoria de menos de dois salários mínimos. E quase ninguém fora daquela casa sabia.</w:t>
       </w:r>
     </w:p>
     <w:p>

</xml_diff>

<commit_message>
Roberto Müller: parte 1 (introdução)
Co-Authored-By: Claude Opus 5.5 <noreply@anthropic.com>
Claude-Session: https://claude.ai/code/session_01MJjUEEZrxQDEUifKK2vj9g
</commit_message>
<xml_diff>
--- a/roteiros/roberto-muller/RobertoMuller_Parte1_Introducao.docx
+++ b/roteiros/roberto-muller/RobertoMuller_Parte1_Introducao.docx
@@ -7,7 +7,7 @@
         <w:pStyle w:val="Heading1"/>
       </w:pPr>
       <w:r>
-        <w:t>ROBERTO MÜLLER — Parte 1: Gancho e introdução</w:t>
+        <w:t>ROBERTO MÜLLER — Parte 1: Introdução</w:t>
       </w:r>
     </w:p>
     <w:p>
@@ -31,7 +31,7 @@
         <w:rPr>
           <w:color w:val="C00000"/>
         </w:rPr>
-        <w:t>Fique até o final, porque você vai entender como o homem dos seis discos de ouro chegou ao ponto de precisar de doações de cinquenta reais pra sobreviver.</w:t>
+        <w:t>Fique até o final, porque você vai entender como o homem dos seis discos de ouro chegou ao ponto de depender de doações de cinquenta reais para sobreviver.</w:t>
       </w:r>
     </w:p>
     <w:p>
@@ -39,7 +39,7 @@
         <w:rPr>
           <w:color w:val="000000"/>
         </w:rPr>
-        <w:t>Para entender como isso foi possível, você precisa conhecer o menino que existia antes do nome famoso. Porque tudo o que aconteceu com Roberto Müller começou com uma troca. Ele deixou um nome para trás. E o Brasil, no fim, esqueceu os dois.</w:t>
+        <w:t>Dois mil e dois.</w:t>
       </w:r>
     </w:p>
     <w:p>
@@ -47,7 +47,7 @@
         <w:rPr>
           <w:color w:val="000000"/>
         </w:rPr>
-        <w:t>O nome verdadeiro dele era José Ribamar da Silva.</w:t>
+        <w:t>Numa churrascaria de Teresina, no Piauí, um cantor de sessenta e cinco anos estava sendo homenageado. A festa era para celebrar a carreira dele, uma das mais longas da música romântica do Nordeste.</w:t>
       </w:r>
     </w:p>
     <w:p>
@@ -55,7 +55,7 @@
         <w:rPr>
           <w:color w:val="000000"/>
         </w:rPr>
-        <w:t>Nasceu no dia dezessete de fevereiro de mil novecentos e trinta e sete, em Piracuruca, uma cidade pequena do norte do Piauí, perto das formações de pedra de Sete Cidades.</w:t>
+        <w:t>O nome no cartaz era Roberto Müller. O Pingo de Ouro.</w:t>
       </w:r>
     </w:p>
     <w:p>
@@ -63,7 +63,7 @@
         <w:rPr>
           <w:color w:val="000000"/>
         </w:rPr>
-        <w:t>Um lugar de onde, naquela época, pouquíssima gente saía para ganhar o país.</w:t>
+        <w:t>No meio da noite, um fã se aproximou com um livro na mão. Queria mostrar uma coisa ao ídolo.</w:t>
       </w:r>
     </w:p>
     <w:p>
@@ -71,7 +71,7 @@
         <w:rPr>
           <w:color w:val="000000"/>
         </w:rPr>
-        <w:t>José Ribamar era baixinho. Quando adulto, teria um metro e cinquenta e três de altura. Um detalhe que parece pequeno. Mas, segundo quem conta a história dele, anos depois esse tamanho viraria parte do apelido que o Brasil inteiro conheceria.</w:t>
+        <w:t>Era um livro didático, lançado pelo próprio governo do Piauí para as escolas do estado. O título era "Educação sem fronteiras".</w:t>
       </w:r>
     </w:p>
     <w:p>
@@ -79,7 +79,47 @@
         <w:rPr>
           <w:color w:val="000000"/>
         </w:rPr>
-        <w:t>Mas a voz que saía daquele corpo pequeno enchia qualquer sala.</w:t>
+        <w:t>Na página catorze, havia um texto sobre ele.</w:t>
+      </w:r>
+    </w:p>
+    <w:p>
+      <w:r>
+        <w:rPr>
+          <w:color w:val="000000"/>
+        </w:rPr>
+        <w:t>Dizia que Roberto Müller tinha morrido ainda jovem. E que era lembrado com carinho pela sua contribuição à arte.</w:t>
+      </w:r>
+    </w:p>
+    <w:p>
+      <w:r>
+        <w:rPr>
+          <w:color w:val="000000"/>
+        </w:rPr>
+        <w:t>Esse é o primeiro objeto dessa história. Um livro escolar, com a página catorze aberta, anunciando a morte de um homem que estava ali, de pé, lendo a própria notícia.</w:t>
+      </w:r>
+    </w:p>
+    <w:p>
+      <w:r>
+        <w:rPr>
+          <w:color w:val="000000"/>
+        </w:rPr>
+        <w:t>Os alunos do Piauí estavam aprendendo na escola que o maior cantor romântico da terra deles já tinha morrido.</w:t>
+      </w:r>
+    </w:p>
+    <w:p>
+      <w:r>
+        <w:rPr>
+          <w:color w:val="000000"/>
+        </w:rPr>
+        <w:t>Roberto não levou na brincadeira. Procurou advogados e entrou na Justiça contra o governo do estado.</w:t>
+      </w:r>
+    </w:p>
+    <w:p>
+      <w:r>
+        <w:rPr>
+          <w:color w:val="000000"/>
+        </w:rPr>
+        <w:t>Anos depois, ainda dizia que não abria mão da indenização.</w:t>
       </w:r>
     </w:p>
     <w:p>
@@ -87,7 +127,7 @@
         <w:rPr>
           <w:color w:val="C00000"/>
         </w:rPr>
-        <w:t>Guarde esse detalhe da altura. Porque o homem que foi chamado de pingo pelo tamanho acabaria virando ouro pela voz. E, no fim da vida, o país trataria esse ouro como se ele nunca tivesse existido.</w:t>
+        <w:t>Só que aquele livro foi apenas a primeira vez. Porque, mais de vinte anos depois, o Brasil ia enterrar Roberto Müller de novo, antes da hora. E, dessa vez, ele já não tinha voz para desmentir.</w:t>
       </w:r>
     </w:p>
     <w:p>
@@ -95,7 +135,7 @@
         <w:rPr>
           <w:color w:val="000000"/>
         </w:rPr>
-        <w:t>Em mil novecentos e cinquenta e cinco, aos dezoito anos, José Ribamar atravessou a divisa e foi parar em São Luís, no Maranhão.</w:t>
+        <w:t>Para entender como um homem chega a ser dado como morto pela própria terra, é preciso voltar ao começo.</w:t>
       </w:r>
     </w:p>
     <w:p>
@@ -103,7 +143,7 @@
         <w:rPr>
           <w:color w:val="000000"/>
         </w:rPr>
-        <w:t>Lá existia uma emissora chamada Rádio Timbira. E foi num dos microfones da Timbira que ele cantou pela primeira vez para um público de verdade.</w:t>
+        <w:t>Dezessete de fevereiro de mil novecentos e trinta e sete.</w:t>
       </w:r>
     </w:p>
     <w:p>
@@ -111,7 +151,7 @@
         <w:rPr>
           <w:color w:val="000000"/>
         </w:rPr>
-        <w:t>Naquela época, o rádio era tudo. Era a televisão, a internet e o jornal ao mesmo tempo. Uma voz que tocava no rádio entrava na cozinha das famílias, na barbearia, no balcão do bar, na boleia do caminhão.</w:t>
+        <w:t>Em Piracuruca, uma cidade pequena do norte do Piauí, nasceu um menino chamado José Ribamar da Silva.</w:t>
       </w:r>
     </w:p>
     <w:p>
@@ -119,7 +159,7 @@
         <w:rPr>
           <w:color w:val="000000"/>
         </w:rPr>
-        <w:t>E a voz de José Ribamar começou a entrar.</w:t>
+        <w:t>Um nome comum, como o de milhares de meninos nordestinos daquela época.</w:t>
       </w:r>
     </w:p>
     <w:p>
@@ -127,7 +167,7 @@
         <w:rPr>
           <w:color w:val="000000"/>
         </w:rPr>
-        <w:t>Recebeu o incentivo de gente do próprio rádio maranhense, como a radialista Orlandira Matos. Gente que ouviu aquele rapaz franzino cantar e percebeu que ali havia alguma coisa rara.</w:t>
+        <w:t>Da infância dele, quase nada ficou registrado. Nenhuma entrevista conhecida conta quem eram os pais dele ou como a família sobrevivia. O menino de Piracuruca some dos registros até o dia em que resolve cantar.</w:t>
       </w:r>
     </w:p>
     <w:p>
@@ -135,7 +175,7 @@
         <w:rPr>
           <w:color w:val="000000"/>
         </w:rPr>
-        <w:t>Mas São Luís era pequena para o que ele queria.</w:t>
+        <w:t>Esse dia chegou cedo.</w:t>
       </w:r>
     </w:p>
     <w:p>
@@ -143,7 +183,7 @@
         <w:rPr>
           <w:color w:val="000000"/>
         </w:rPr>
-        <w:t>Todo cantor do Norte e do Nordeste daquele tempo sabia de uma verdade dura. Para ser alguém no Brasil, era preciso ir para o Rio de Janeiro. Era lá que ficavam as grandes rádios, as gravadoras, os programas de auditório.</w:t>
+        <w:t>Em mil novecentos e cinquenta e cinco, com dezoito anos, José Ribamar estreou na Rádio Timbira, em São Luís, no Maranhão.</w:t>
       </w:r>
     </w:p>
     <w:p>
@@ -151,7 +191,15 @@
         <w:rPr>
           <w:color w:val="000000"/>
         </w:rPr>
-        <w:t>E foi para lá que ele foi.</w:t>
+        <w:t>Naquele tempo, o rádio era a televisão do Brasil. Uma voz que entrava no ar podia chegar a casas de cidades inteiras. E foi ali que aquele rapaz do interior descobriu que a voz dele fazia as pessoas pararem para ouvir.</w:t>
+      </w:r>
+    </w:p>
+    <w:p>
+      <w:r>
+        <w:rPr>
+          <w:color w:val="000000"/>
+        </w:rPr>
+        <w:t>Em algum momento daqueles anos, José Ribamar da Silva deixou de existir para o público. No lugar dele, nasceu um nome que parecia de outro país. Roberto Müller.</w:t>
       </w:r>
     </w:p>
     <w:p>
@@ -159,7 +207,7 @@
         <w:rPr>
           <w:color w:val="C00000"/>
         </w:rPr>
-        <w:t>Mas o Rio que recebeu aquele rapaz do Piauí estava muito longe do glamour que aparecia nas revistas. E os primeiros palcos que ele encontrou ficavam em lugares onde as famílias que ouviam rádio jamais iriam.</w:t>
+        <w:t>Guarde esse nome estrangeiro. Porque um cantor nordestino com nome de galã europeu ia conquistar o Brasil inteiro. E, décadas depois, esse mesmo nome ia aparecer num livro de escola, ao lado de uma palavra que ele jamais esperava ler.</w:t>
       </w:r>
     </w:p>
     <w:p>
@@ -167,7 +215,7 @@
         <w:rPr>
           <w:color w:val="000000"/>
         </w:rPr>
-        <w:t>No fim dos anos cinquenta, José Ribamar desembarcou no Rio de Janeiro, que ainda era a capital do país.</w:t>
+        <w:t>Mil novecentos e cinquenta e oito.</w:t>
       </w:r>
     </w:p>
     <w:p>
@@ -175,7 +223,7 @@
         <w:rPr>
           <w:color w:val="000000"/>
         </w:rPr>
-        <w:t>E o primeiro lugar que abriu as portas para ele foi a Lapa.</w:t>
+        <w:t>Roberto Müller desembarcou no Rio de Janeiro, a capital do país na época, onde tudo acontecia.</w:t>
       </w:r>
     </w:p>
     <w:p>
@@ -183,7 +231,7 @@
         <w:rPr>
           <w:color w:val="000000"/>
         </w:rPr>
-        <w:t>A Lapa daquela época era o coração da boemia carioca. Ruas iluminadas de madrugada, cabarés, salões de dança, homens de terno e chapéu, mulheres pagas para dançar com quem comprasse o bilhete.</w:t>
+        <w:t>Antes dos estúdios, veio a noite.</w:t>
       </w:r>
     </w:p>
     <w:p>
@@ -191,7 +239,7 @@
         <w:rPr>
           <w:color w:val="000000"/>
         </w:rPr>
-        <w:t>E foi nesses salões que ele começou a cantar.</w:t>
+        <w:t>Cantou no Cabaré Brasil, na Lapa. Depois, no Dancing Avenida e na Boate Balalaika. Casas noturnas cheias de fumaça e de gente que chegava sozinha e ia embora acompanhada.</w:t>
       </w:r>
     </w:p>
     <w:p>
@@ -199,7 +247,7 @@
         <w:rPr>
           <w:color w:val="000000"/>
         </w:rPr>
-        <w:t>Cabaré Brasil. Dancing Avenida. Boite Balalaika. Dancing Brasil.</w:t>
+        <w:t>Era ali que um cantor romântico aprendia o ofício. Cantando para quem tinha acabado de perder um amor. Ou para quem estava prestes a perder.</w:t>
       </w:r>
     </w:p>
     <w:p>
@@ -207,7 +255,7 @@
         <w:rPr>
           <w:color w:val="000000"/>
         </w:rPr>
-        <w:t>Eram lugares onde a música tocava até o dia clarear. Onde o cantor disputava atenção com a dança, a bebida e os casais que se formavam por uma noite.</w:t>
+        <w:t>Em mil novecentos e sessenta, gravou o primeiro disco de vinil, pela Columbia.</w:t>
       </w:r>
     </w:p>
     <w:p>
@@ -215,7 +263,7 @@
         <w:rPr>
           <w:color w:val="000000"/>
         </w:rPr>
-        <w:t>Imagine um rapaz de um metro e cinquenta e três, vindo do interior do Piauí, cantando boleros de amor às três da manhã para gente que mal olhava para o palco.</w:t>
+        <w:t>Em mil novecentos e sessenta e três, veio o disco que mudou tudo. "Nunca Mais Brigarei Contigo".</w:t>
       </w:r>
     </w:p>
     <w:p>
@@ -223,7 +271,15 @@
         <w:rPr>
           <w:color w:val="000000"/>
         </w:rPr>
-        <w:t>Era ali que ele aprendia o ofício.</w:t>
+        <w:t>A música se espalhou pelo rádio. O rapaz de Piracuruca virou voz conhecida em todo o país.</w:t>
+      </w:r>
+    </w:p>
+    <w:p>
+      <w:r>
+        <w:rPr>
+          <w:color w:val="C00000"/>
+        </w:rPr>
+        <w:t>Imagine o que era, para um menino nascido numa cidade pequena do Piauí, ouvir a própria voz tocando nas rádios do Brasil inteiro. Só que o sucesso tinha um preço. E ninguém avisou Roberto Müller de que a fama, um dia, ia cobrar tudo de volta.</w:t>
       </w:r>
     </w:p>
     <w:p>
@@ -231,7 +287,7 @@
         <w:rPr>
           <w:color w:val="000000"/>
         </w:rPr>
-        <w:t>Aprendia a segurar a voz nas notas longas, a olhar para a plateia, a fazer uma mulher parar de dançar para ouvir. Aprendia, principalmente, a cantar a dor de amor, que era o que aquele público queria ouvir.</w:t>
+        <w:t>Mesmo famoso, ele nunca esqueceu de onde tinha vindo.</w:t>
       </w:r>
     </w:p>
     <w:p>
@@ -239,7 +295,7 @@
         <w:rPr>
           <w:color w:val="000000"/>
         </w:rPr>
-        <w:t>E, nesse começo de carreira, José Ribamar da Silva deixou de existir para o público.</w:t>
+        <w:t>Nos anos sessenta, voltou ao Piauí para cantar em Luzilândia. O palco era um circo, armado na Praça São Francisco.</w:t>
       </w:r>
     </w:p>
     <w:p>
@@ -247,7 +303,7 @@
         <w:rPr>
           <w:color w:val="000000"/>
         </w:rPr>
-        <w:t>No lugar dele nasceu Roberto Müller.</w:t>
+        <w:t>Alguém perguntou se um cantor daquele tamanho não estava se rebaixando, cantando debaixo de uma lona.</w:t>
       </w:r>
     </w:p>
     <w:p>
@@ -255,7 +311,23 @@
         <w:rPr>
           <w:color w:val="000000"/>
         </w:rPr>
-        <w:t>Um nome que soava estrangeiro, elegante, quase de cinema. Muito diferente do nome de batismo do menino de Piracuruca.</w:t>
+        <w:t>A resposta ficou na memória da cidade. Roberto disse que era piauiense. E que, na terra dele, cantaria até nas cozinhas e nos quintais.</w:t>
+      </w:r>
+    </w:p>
+    <w:p>
+      <w:r>
+        <w:rPr>
+          <w:color w:val="000000"/>
+        </w:rPr>
+        <w:t>Um homem que cantaria até nos quintais da própria terra.</w:t>
+      </w:r>
+    </w:p>
+    <w:p>
+      <w:r>
+        <w:rPr>
+          <w:color w:val="000000"/>
+        </w:rPr>
+        <w:t>Quase quarenta anos depois, essa mesma terra ia imprimir, num livro para crianças, que ele estava morto.</w:t>
       </w:r>
     </w:p>
     <w:p>
@@ -263,111 +335,7 @@
         <w:rPr>
           <w:color w:val="C00000"/>
         </w:rPr>
-        <w:t>Aqui é onde tudo muda. Porque o nome novo abriu portas que o antigo nunca abriria. Mas também criou uma distância entre o homem e o artista. E foi exatamente nessa distância que, décadas depois, o Brasil o perdeu de vista.</w:t>
-      </w:r>
-    </w:p>
-    <w:p>
-      <w:r>
-        <w:rPr>
-          <w:color w:val="000000"/>
-        </w:rPr>
-        <w:t>As boates da Lapa levaram Roberto às rádios.</w:t>
-      </w:r>
-    </w:p>
-    <w:p>
-      <w:r>
-        <w:rPr>
-          <w:color w:val="000000"/>
-        </w:rPr>
-        <w:t>E as rádios do Rio, naquela época, eram gigantes. Ele passou por algumas das mais importantes do país. A Rádio Excelsior. A Mayrink Veiga. E a mais poderosa de todas, a Rádio Nacional.</w:t>
-      </w:r>
-    </w:p>
-    <w:p>
-      <w:r>
-        <w:rPr>
-          <w:color w:val="000000"/>
-        </w:rPr>
-        <w:t>Cantar na Nacional era como aparecer hoje no horário nobre da televisão. O Brasil inteiro ouvia.</w:t>
-      </w:r>
-    </w:p>
-    <w:p>
-      <w:r>
-        <w:rPr>
-          <w:color w:val="000000"/>
-        </w:rPr>
-        <w:t>E, no começo dos anos sessenta, veio a gravação que mudaria tudo.</w:t>
-      </w:r>
-    </w:p>
-    <w:p>
-      <w:r>
-        <w:rPr>
-          <w:color w:val="000000"/>
-        </w:rPr>
-        <w:t>Uma canção com um título que parecia promessa de namorado arrependido. "Nunca Mais Brigarei Contigo".</w:t>
-      </w:r>
-    </w:p>
-    <w:p>
-      <w:r>
-        <w:rPr>
-          <w:color w:val="000000"/>
-        </w:rPr>
-        <w:t>A música estourou.</w:t>
-      </w:r>
-    </w:p>
-    <w:p>
-      <w:r>
-        <w:rPr>
-          <w:color w:val="000000"/>
-        </w:rPr>
-        <w:t>Tocou nas rádios de norte a sul. Tocou nos alto-falantes das praças do interior, nas vitrolas das casas, nos bailes de sábado.</w:t>
-      </w:r>
-    </w:p>
-    <w:p>
-      <w:r>
-        <w:rPr>
-          <w:color w:val="000000"/>
-        </w:rPr>
-        <w:t>De repente, o rapaz que cantava de madrugada para casais distraídos nos cabarés da Lapa tinha virado um nome nacional.</w:t>
-      </w:r>
-    </w:p>
-    <w:p>
-      <w:r>
-        <w:rPr>
-          <w:color w:val="000000"/>
-        </w:rPr>
-        <w:t>Roberto Müller.</w:t>
-      </w:r>
-    </w:p>
-    <w:p>
-      <w:r>
-        <w:rPr>
-          <w:color w:val="000000"/>
-        </w:rPr>
-        <w:t>Nesse ponto entra o primeiro objeto dessa história. Um disco de ouro. Ao longo da carreira, Roberto Müller receberia seis deles. Seis discos de ouro, a prova física de que multidões de brasileiros compraram a voz dele.</w:t>
-      </w:r>
-    </w:p>
-    <w:p>
-      <w:r>
-        <w:rPr>
-          <w:color w:val="C00000"/>
-        </w:rPr>
-        <w:t>Lembre bem desses seis discos de ouro. Porque, sessenta anos depois, o dono deles estaria vivendo num apartamento modesto no Recife, com uma aposentadoria de menos de dois salários mínimos. E quase ninguém fora daquela casa sabia.</w:t>
-      </w:r>
-    </w:p>
-    <w:p>
-      <w:r>
-        <w:rPr>
-          <w:color w:val="000000"/>
-        </w:rPr>
-        <w:t>Mas antes de chegar a essa casa, Roberto ainda ia subir muito alto.</w:t>
-      </w:r>
-    </w:p>
-    <w:p>
-      <w:r>
-        <w:rPr>
-          <w:color w:val="000000"/>
-        </w:rPr>
-        <w:t>Tão alto que o apresentador mais famoso da televisão brasileira ia batizá-lo com o apelido que ficaria para sempre.</w:t>
+        <w:t>O homem que deu a Roberto Müller o apelido que ele carregou até o fim da vida era um dos maiores nomes da televisão brasileira. Um apresentador que transformava cantores desconhecidos em estrelas com uma única apresentação no programa dele.</w:t>
       </w:r>
     </w:p>
     <w:sectPr>

</xml_diff>